<commit_message>
Follow Task Board voice and asset rules
Add a dated last verified line to the website and script document, use a
PNG poster instead of JPEG because it carries text, replace the arrow
symbol on the download buttons with a word, and add checks for dashes,
emoji, arrow symbols, filler verbs and the last verified line (26 checks).
</commit_message>
<xml_diff>
--- a/public/docs/one-building-one-token-script.docx
+++ b/public/docs/one-building-one-token-script.docx
@@ -328,6 +328,60 @@
                 <w:szCs w:val="20"/>
               </w:rPr>
               <w:t xml:space="preserve">Australian and British English</w:t>
+            </w:r>
+          </w:p>
+        </w:tc>
+      </w:tr>
+      <w:tr>
+        <w:tc>
+          <w:tcPr>
+            <w:tcW w:type="pct" w:w="25%"/>
+            <w:tcMar>
+              <w:top w:type="dxa" w:w="80"/>
+              <w:left w:type="dxa" w:w="100"/>
+              <w:bottom w:type="dxa" w:w="80"/>
+              <w:right w:type="dxa" w:w="100"/>
+            </w:tcMar>
+          </w:tcPr>
+          <w:p>
+            <w:pPr>
+              <w:spacing w:after="0"/>
+            </w:pPr>
+            <w:r>
+              <w:rPr>
+                <w:rFonts w:ascii="Montserrat" w:cs="Montserrat" w:eastAsia="Montserrat" w:hAnsi="Montserrat"/>
+                <w:b/>
+                <w:bCs/>
+                <w:color w:val="343740"/>
+                <w:sz w:val="20"/>
+                <w:szCs w:val="20"/>
+              </w:rPr>
+              <w:t xml:space="preserve">Last verified</w:t>
+            </w:r>
+          </w:p>
+        </w:tc>
+        <w:tc>
+          <w:tcPr>
+            <w:tcW w:type="pct" w:w="75%"/>
+            <w:tcMar>
+              <w:top w:type="dxa" w:w="80"/>
+              <w:left w:type="dxa" w:w="100"/>
+              <w:bottom w:type="dxa" w:w="80"/>
+              <w:right w:type="dxa" w:w="100"/>
+            </w:tcMar>
+          </w:tcPr>
+          <w:p>
+            <w:pPr>
+              <w:spacing w:after="0"/>
+            </w:pPr>
+            <w:r>
+              <w:rPr>
+                <w:rFonts w:ascii="Montserrat" w:cs="Montserrat" w:eastAsia="Montserrat" w:hAnsi="Montserrat"/>
+                <w:color w:val="343740"/>
+                <w:sz w:val="20"/>
+                <w:szCs w:val="20"/>
+              </w:rPr>
+              <w:t xml:space="preserve">22 October 2026, against the source snapshots in evidence/ (capture times in evidence/manifest.json)</w:t>
             </w:r>
           </w:p>
         </w:tc>

</xml_diff>